<commit_message>
Add architecture/GCP infra diagrams, remove AI mentions, update repo links
</commit_message>
<xml_diff>
--- a/CI_CD_SETUP.docx
+++ b/CI_CD_SETUP.docx
@@ -116,54 +116,39 @@
     </w:p>
     <w:p>
       <w:r>
-        <w:t xml:space="preserve">Va sur </w:t>
+        <w:t>Va sur github.com/wiameazim/Techpapy_v1 → Settings → Secrets and variables → Actions → New repository secret, et ajoute chacun de ces secrets :</w:t>
       </w:r>
       <w:r>
         <w:rPr>
           <w:rFonts w:ascii="Consolas" w:hAnsi="Consolas"/>
           <w:sz w:val="19"/>
         </w:rPr>
-        <w:t>github.com/Aminezy/techpapy-</w:t>
       </w:r>
-      <w:r>
-        <w:t xml:space="preserve"> → </w:t>
-      </w:r>
+      <w:r/>
       <w:r>
         <w:rPr>
           <w:b/>
         </w:rPr>
-        <w:t>Settings</w:t>
       </w:r>
-      <w:r>
-        <w:t xml:space="preserve"> → </w:t>
-      </w:r>
+      <w:r/>
       <w:r>
         <w:rPr>
           <w:b/>
         </w:rPr>
-        <w:t>Secrets and variables</w:t>
       </w:r>
-      <w:r>
-        <w:t xml:space="preserve"> → </w:t>
-      </w:r>
+      <w:r/>
       <w:r>
         <w:rPr>
           <w:b/>
         </w:rPr>
-        <w:t>Actions</w:t>
       </w:r>
-      <w:r>
-        <w:t xml:space="preserve"> → </w:t>
-      </w:r>
+      <w:r/>
       <w:r>
         <w:rPr>
           <w:b/>
         </w:rPr>
-        <w:t>New repository secret</w:t>
       </w:r>
-      <w:r>
-        <w:t>, et ajoute chacun de ces secrets :</w:t>
-      </w:r>
+      <w:r/>
     </w:p>
     <w:tbl>
       <w:tblPr>

</xml_diff>